<commit_message>
Corrige la alineación de las etiquetas en la plantilla de imputación
Las líneas "GRADO Y NOMBRE DEL INVESTIGADO", "UNIDAD/SUB-UNIDAD",
"GRADO Y NOMBRE DEL SUPERIOR", "DIRECCIÓN" y "PLAZO DE DESCARGO" usaban
cada una una mezcla distinta de espacios manuales y tabulaciones para
llegar a los ":", por eso los dos puntos quedaban en columnas distintas
según el largo de cada etiqueta. Además, "GRADO Y NOMBRE DEL INVESTIGADO"
estaba partido en dos párrafos separados (un resto de una edición previa),
por lo que "INVESTIGADO" quedaba suelto en su propia línea.

Se unifica todo a una sola tabulación real en la misma posición (4700
twips) para las cinco líneas, y se fusiona el párrafo partido en uno solo.
</commit_message>
<xml_diff>
--- a/plantillas/plantilla_imputacion_leve.docx
+++ b/plantillas/plantilla_imputacion_leve.docx
@@ -72,9 +72,9 @@
     <w:p>
       <w:pPr>
         <w:tabs>
-          <w:tab w:val="left" w:pos="3544"/>
-        </w:tabs>
-        <w:ind w:left="3828" w:hanging="3828"/>
+          <w:tab w:val="left" w:pos="4700"/>
+        </w:tabs>
+        <w:ind w:left="4700" w:hanging="4700"/>
         <w:jc w:val="both"/>
         <w:rPr>
           <w:rFonts w:cs="Arial"/>
@@ -91,15 +91,9 @@
           <w:sz w:val="24"/>
           <w:szCs w:val="24"/>
         </w:rPr>
-        <w:t xml:space="preserve">GRADO Y NOMBRE DEL                :</w:t>
-      </w:r>
-      <w:r>
-        <w:rPr>
-          <w:rFonts w:cs="Arial"/>
-          <w:sz w:val="24"/>
-          <w:szCs w:val="24"/>
-        </w:rPr>
-        <w:t xml:space="preserve"> </w:t>
+        <w:t>GRADO Y NOMBRE DEL INVESTIGADO</w:t>
+        <w:tab/>
+        <w:t xml:space="preserve">: </w:t>
       </w:r>
       <w:r>
         <w:rPr>
@@ -125,8 +119,76 @@
         <w:tabs>
           <w:tab w:val="left" w:pos="3544"/>
         </w:tabs>
-        <w:ind w:left="3828" w:hanging="3828"/>
+        <w:ind w:left="3969" w:hanging="3969"/>
+        <w:rPr>
+          <w:rFonts w:cs="Arial"/>
+          <w:b/>
+          <w:bCs/>
+          <w:sz w:val="24"/>
+          <w:szCs w:val="24"/>
+        </w:rPr>
+      </w:pPr>
+    </w:p>
+    <w:p>
+      <w:pPr>
+        <w:tabs>
+          <w:tab w:val="left" w:pos="4700"/>
+        </w:tabs>
+        <w:ind w:left="4700" w:hanging="4700"/>
+        <w:rPr>
+          <w:rFonts w:cs="Arial"/>
+          <w:sz w:val="24"/>
+          <w:szCs w:val="24"/>
+        </w:rPr>
+      </w:pPr>
+      <w:r>
+        <w:rPr>
+          <w:rFonts w:cs="Arial"/>
+          <w:b/>
+          <w:bCs/>
+          <w:sz w:val="24"/>
+          <w:szCs w:val="24"/>
+        </w:rPr>
+        <w:t>UNIDAD/SUB-UNIDAD</w:t>
+        <w:tab/>
+        <w:t xml:space="preserve">: </w:t>
+      </w:r>
+      <w:r>
+        <w:rPr>
+          <w:rFonts w:cs="Arial"/>
+          <w:sz w:val="24"/>
+          <w:szCs w:val="24"/>
+        </w:rPr>
+        <w:t>{unidad_investigado}</w:t>
+      </w:r>
+    </w:p>
+    <w:p>
+      <w:pPr>
+        <w:tabs>
+          <w:tab w:val="left" w:pos="3969"/>
+        </w:tabs>
         <w:jc w:val="both"/>
+        <w:rPr>
+          <w:rFonts w:cs="Arial"/>
+          <w:b/>
+          <w:sz w:val="24"/>
+          <w:szCs w:val="24"/>
+        </w:rPr>
+      </w:pPr>
+    </w:p>
+    <w:p>
+      <w:pPr>
+        <w:tabs>
+          <w:tab w:val="left" w:pos="4700"/>
+        </w:tabs>
+        <w:jc w:val="both"/>
+        <w:rPr>
+          <w:rFonts w:cs="Arial"/>
+          <w:sz w:val="24"/>
+          <w:szCs w:val="24"/>
+        </w:rPr>
+      </w:pPr>
+      <w:r>
         <w:rPr>
           <w:rFonts w:cs="Arial"/>
           <w:b/>
@@ -134,17 +196,17 @@
           <w:szCs w:val="24"/>
           <w:lang w:val="es-PE"/>
         </w:rPr>
-      </w:pPr>
+        <w:t>DESCRIPCIÓN DEL HECHO</w:t>
+        <w:tab/>
+        <w:t>:</w:t>
+      </w:r>
       <w:r>
         <w:rPr>
           <w:rFonts w:cs="Arial"/>
-          <w:b/>
           <w:sz w:val="24"/>
           <w:szCs w:val="24"/>
-          <w:lang w:val="es-PE"/>
-        </w:rPr>
-        <w:t>INVESTIGADO</w:t>
-        <w:tab/>
+        </w:rPr>
+        <w:t xml:space="preserve"> {descripcion_hecho} </w:t>
       </w:r>
     </w:p>
     <w:p>
@@ -152,7 +214,27 @@
         <w:tabs>
           <w:tab w:val="left" w:pos="3544"/>
         </w:tabs>
-        <w:ind w:left="3969" w:hanging="3969"/>
+        <w:jc w:val="both"/>
+        <w:rPr>
+          <w:rFonts w:cs="Arial"/>
+          <w:sz w:val="24"/>
+          <w:szCs w:val="24"/>
+        </w:rPr>
+      </w:pPr>
+    </w:p>
+    <w:p>
+      <w:pPr>
+        <w:tabs>
+          <w:tab w:val="left" w:pos="4700"/>
+        </w:tabs>
+        <w:jc w:val="both"/>
+        <w:rPr>
+          <w:rFonts w:cs="Arial"/>
+          <w:sz w:val="24"/>
+          <w:szCs w:val="24"/>
+        </w:rPr>
+      </w:pPr>
+      <w:r>
         <w:rPr>
           <w:rFonts w:cs="Arial"/>
           <w:b/>
@@ -160,144 +242,7 @@
           <w:sz w:val="24"/>
           <w:szCs w:val="24"/>
         </w:rPr>
-      </w:pPr>
-    </w:p>
-    <w:p>
-      <w:pPr>
-        <w:tabs>
-          <w:tab w:val="left" w:pos="3544"/>
-        </w:tabs>
-        <w:ind w:left="3969" w:hanging="3969"/>
-        <w:rPr>
-          <w:rFonts w:cs="Arial"/>
-          <w:sz w:val="24"/>
-          <w:szCs w:val="24"/>
-        </w:rPr>
-      </w:pPr>
-      <w:r>
-        <w:rPr>
-          <w:rFonts w:cs="Arial"/>
-          <w:b/>
-          <w:bCs/>
-          <w:sz w:val="24"/>
-          <w:szCs w:val="24"/>
-        </w:rPr>
-        <w:t>UNIDAD/SUB-UNIDAD</w:t>
-      </w:r>
-      <w:r>
-        <w:rPr>
-          <w:rFonts w:cs="Arial"/>
-          <w:sz w:val="24"/>
-          <w:szCs w:val="24"/>
-        </w:rPr>
-        <w:tab/>
-      </w:r>
-      <w:r>
-        <w:rPr>
-          <w:rFonts w:cs="Arial"/>
-          <w:b/>
-          <w:bCs/>
-          <w:sz w:val="24"/>
-          <w:szCs w:val="24"/>
-        </w:rPr>
-        <w:t xml:space="preserve">:  </w:t>
-      </w:r>
-      <w:r>
-        <w:rPr>
-          <w:rFonts w:cs="Arial"/>
-          <w:sz w:val="24"/>
-          <w:szCs w:val="24"/>
-        </w:rPr>
-        <w:t>{unidad_investigado}</w:t>
-      </w:r>
-    </w:p>
-    <w:p>
-      <w:pPr>
-        <w:tabs>
-          <w:tab w:val="left" w:pos="3969"/>
-        </w:tabs>
-        <w:jc w:val="both"/>
-        <w:rPr>
-          <w:rFonts w:cs="Arial"/>
-          <w:b/>
-          <w:sz w:val="24"/>
-          <w:szCs w:val="24"/>
-        </w:rPr>
-      </w:pPr>
-    </w:p>
-    <w:p>
-      <w:pPr>
-        <w:tabs>
-          <w:tab w:val="left" w:pos="3544"/>
-        </w:tabs>
-        <w:jc w:val="both"/>
-        <w:rPr>
-          <w:rFonts w:cs="Arial"/>
-          <w:sz w:val="24"/>
-          <w:szCs w:val="24"/>
-        </w:rPr>
-      </w:pPr>
-      <w:r>
-        <w:rPr>
-          <w:rFonts w:cs="Arial"/>
-          <w:b/>
-          <w:sz w:val="24"/>
-          <w:szCs w:val="24"/>
-          <w:lang w:val="es-PE"/>
-        </w:rPr>
-        <w:t xml:space="preserve">DESCRIPCIÓN DEL HECHO           :</w:t>
-      </w:r>
-      <w:r>
-        <w:rPr>
-          <w:rFonts w:cs="Arial"/>
-          <w:sz w:val="24"/>
-          <w:szCs w:val="24"/>
-        </w:rPr>
-        <w:t xml:space="preserve"> {descripcion_hecho} </w:t>
-      </w:r>
-    </w:p>
-    <w:p>
-      <w:pPr>
-        <w:tabs>
-          <w:tab w:val="left" w:pos="3544"/>
-        </w:tabs>
-        <w:jc w:val="both"/>
-        <w:rPr>
-          <w:rFonts w:cs="Arial"/>
-          <w:sz w:val="24"/>
-          <w:szCs w:val="24"/>
-        </w:rPr>
-      </w:pPr>
-    </w:p>
-    <w:p>
-      <w:pPr>
-        <w:tabs>
-          <w:tab w:val="left" w:pos="3544"/>
-        </w:tabs>
-        <w:jc w:val="both"/>
-        <w:rPr>
-          <w:rFonts w:cs="Arial"/>
-          <w:sz w:val="24"/>
-          <w:szCs w:val="24"/>
-        </w:rPr>
-      </w:pPr>
-      <w:r>
-        <w:rPr>
-          <w:rFonts w:cs="Arial"/>
-          <w:b/>
-          <w:bCs/>
-          <w:sz w:val="24"/>
-          <w:szCs w:val="24"/>
-        </w:rPr>
-        <w:t xml:space="preserve">DESCRIPCIÓN DE LA INFRACCIÓN   </w:t>
-      </w:r>
-      <w:r>
-        <w:rPr>
-          <w:rFonts w:cs="Arial"/>
-          <w:sz w:val="24"/>
-          <w:szCs w:val="24"/>
-        </w:rPr>
-        <w:t xml:space="preserve">   :</w:t>
+        <w:t>DESCRIPCIÓN DE LA INFRACCIÓN:</w:t>
       </w:r>
     </w:p>
     <w:p>
@@ -411,11 +356,9 @@
     <w:p>
       <w:pPr>
         <w:tabs>
-          <w:tab w:val="left" w:pos="3402"/>
-          <w:tab w:val="left" w:pos="3828"/>
-          <w:tab w:val="left" w:pos="3969"/>
-        </w:tabs>
-        <w:ind w:left="3828" w:hanging="3970"/>
+          <w:tab w:val="left" w:pos="4700"/>
+        </w:tabs>
+        <w:ind w:left="4700" w:hanging="4700"/>
         <w:rPr>
           <w:rFonts w:cs="Arial"/>
           <w:bCs/>
@@ -431,8 +374,50 @@
           <w:sz w:val="24"/>
           <w:szCs w:val="24"/>
         </w:rPr>
-        <w:t xml:space="preserve">GRADO Y NOMBRE DEL SUPERIOR</w:t>
+        <w:t>GRADO Y NOMBRE DEL SUPERIOR</w:t>
+        <w:tab/>
+        <w:t xml:space="preserve">: </w:t>
       </w:r>
+      <w:r>
+        <w:rPr>
+          <w:rFonts w:cs="Arial"/>
+          <w:bCs/>
+          <w:sz w:val="24"/>
+          <w:szCs w:val="24"/>
+        </w:rPr>
+        <w:t xml:space="preserve">{superior_completo}</w:t>
+      </w:r>
+    </w:p>
+    <w:p>
+      <w:pPr>
+        <w:tabs>
+          <w:tab w:val="left" w:pos="3402"/>
+          <w:tab w:val="left" w:pos="3828"/>
+          <w:tab w:val="left" w:pos="3969"/>
+        </w:tabs>
+        <w:ind w:left="4395" w:hanging="4395"/>
+        <w:rPr>
+          <w:rFonts w:cs="Arial"/>
+          <w:sz w:val="24"/>
+          <w:szCs w:val="24"/>
+          <w:lang w:val="es-PE"/>
+        </w:rPr>
+      </w:pPr>
+    </w:p>
+    <w:p>
+      <w:pPr>
+        <w:tabs>
+          <w:tab w:val="left" w:pos="4700"/>
+        </w:tabs>
+        <w:ind w:left="4700" w:hanging="4700"/>
+        <w:rPr>
+          <w:rFonts w:cs="Arial"/>
+          <w:color w:val="FFFFFF" w:themeColor="background1"/>
+          <w:sz w:val="24"/>
+          <w:szCs w:val="24"/>
+          <w:lang w:val="es-PE"/>
+        </w:rPr>
+      </w:pPr>
       <w:r>
         <w:rPr>
           <w:rFonts w:cs="Arial"/>
@@ -441,8 +426,92 @@
           <w:szCs w:val="24"/>
           <w:lang w:val="es-PE"/>
         </w:rPr>
-        <w:t xml:space="preserve">  </w:t>
+        <w:t>UNIDAD/SUB-UNIDAD</w:t>
+        <w:tab/>
+        <w:t xml:space="preserve">: </w:t>
       </w:r>
+      <w:r>
+        <w:rPr>
+          <w:rFonts w:cs="Arial"/>
+          <w:sz w:val="24"/>
+          <w:szCs w:val="24"/>
+        </w:rPr>
+        <w:t>DIVOPUS 3-CPNP VENTANILLA.</w:t>
+      </w:r>
+    </w:p>
+    <w:p>
+      <w:pPr>
+        <w:tabs>
+          <w:tab w:val="left" w:pos="3969"/>
+        </w:tabs>
+        <w:ind w:left="3969" w:hanging="3969"/>
+        <w:rPr>
+          <w:rFonts w:cs="Arial"/>
+          <w:sz w:val="24"/>
+          <w:szCs w:val="24"/>
+          <w:lang w:val="es-PE"/>
+        </w:rPr>
+      </w:pPr>
+    </w:p>
+    <w:p>
+      <w:pPr>
+        <w:tabs>
+          <w:tab w:val="left" w:pos="4700"/>
+        </w:tabs>
+        <w:ind w:left="4700" w:hanging="4700"/>
+        <w:jc w:val="both"/>
+        <w:rPr>
+          <w:rFonts w:cs="Arial"/>
+          <w:sz w:val="24"/>
+          <w:szCs w:val="24"/>
+          <w:lang w:val="es-PE"/>
+        </w:rPr>
+      </w:pPr>
+      <w:r>
+        <w:rPr>
+          <w:rFonts w:cs="Arial"/>
+          <w:b/>
+          <w:sz w:val="24"/>
+          <w:szCs w:val="24"/>
+          <w:lang w:val="pt-BR"/>
+        </w:rPr>
+        <w:t>DIRECCIÓN</w:t>
+        <w:tab/>
+        <w:t xml:space="preserve">: </w:t>
+      </w:r>
+      <w:r>
+        <w:rPr>
+          <w:rFonts w:cs="Arial"/>
+          <w:sz w:val="24"/>
+          <w:szCs w:val="24"/>
+          <w:lang w:val="pt-BR"/>
+        </w:rPr>
+        <w:t xml:space="preserve">Av. Pedro Beltrán N°138 Urb. </w:t>
+      </w:r>
+      <w:r>
+        <w:rPr>
+          <w:rFonts w:cs="Arial"/>
+          <w:sz w:val="24"/>
+          <w:szCs w:val="24"/>
+          <w:lang w:val="es-PE"/>
+        </w:rPr>
+        <w:t>Satélite - Ventanilla.</w:t>
+      </w:r>
+    </w:p>
+    <w:p>
+      <w:pPr>
+        <w:tabs>
+          <w:tab w:val="left" w:pos="4700"/>
+        </w:tabs>
+        <w:spacing w:before="240"/>
+        <w:jc w:val="both"/>
+        <w:rPr>
+          <w:rFonts w:cs="Arial"/>
+          <w:sz w:val="24"/>
+          <w:szCs w:val="24"/>
+          <w:lang w:val="es-PE"/>
+        </w:rPr>
+      </w:pPr>
       <w:r>
         <w:rPr>
           <w:rFonts w:cs="Arial"/>
@@ -451,208 +520,9 @@
           <w:sz w:val="24"/>
           <w:szCs w:val="24"/>
         </w:rPr>
+        <w:t>PLAZO DE DESCARGO</w:t>
+        <w:tab/>
         <w:t>:</w:t>
-      </w:r>
-      <w:r>
-        <w:rPr>
-          <w:rFonts w:cs="Arial"/>
-          <w:b/>
-          <w:sz w:val="24"/>
-          <w:szCs w:val="24"/>
-          <w:lang w:val="es-PE"/>
-        </w:rPr>
-        <w:t xml:space="preserve"> </w:t>
-      </w:r>
-      <w:r>
-        <w:rPr>
-          <w:rFonts w:cs="Arial"/>
-          <w:bCs/>
-          <w:sz w:val="24"/>
-          <w:szCs w:val="24"/>
-        </w:rPr>
-        <w:t xml:space="preserve">{superior_completo}</w:t>
-      </w:r>
-    </w:p>
-    <w:p>
-      <w:pPr>
-        <w:tabs>
-          <w:tab w:val="left" w:pos="3402"/>
-          <w:tab w:val="left" w:pos="3828"/>
-          <w:tab w:val="left" w:pos="3969"/>
-        </w:tabs>
-        <w:ind w:left="4395" w:hanging="4395"/>
-        <w:rPr>
-          <w:rFonts w:cs="Arial"/>
-          <w:sz w:val="24"/>
-          <w:szCs w:val="24"/>
-          <w:lang w:val="es-PE"/>
-        </w:rPr>
-      </w:pPr>
-    </w:p>
-    <w:p>
-      <w:pPr>
-        <w:tabs>
-          <w:tab w:val="left" w:pos="3828"/>
-          <w:tab w:val="left" w:pos="3969"/>
-        </w:tabs>
-        <w:ind w:left="3969" w:hanging="3969"/>
-        <w:rPr>
-          <w:rFonts w:cs="Arial"/>
-          <w:color w:val="FFFFFF" w:themeColor="background1"/>
-          <w:sz w:val="24"/>
-          <w:szCs w:val="24"/>
-          <w:lang w:val="es-PE"/>
-        </w:rPr>
-      </w:pPr>
-      <w:r>
-        <w:rPr>
-          <w:rFonts w:cs="Arial"/>
-          <w:b/>
-          <w:sz w:val="24"/>
-          <w:szCs w:val="24"/>
-          <w:lang w:val="es-PE"/>
-        </w:rPr>
-        <w:t xml:space="preserve">UNIDAD/SUB-UNIDAD                       </w:t>
-        <w:tab/>
-        <w:t xml:space="preserve">  : </w:t>
-      </w:r>
-      <w:r>
-        <w:rPr>
-          <w:rFonts w:cs="Arial"/>
-          <w:sz w:val="24"/>
-          <w:szCs w:val="24"/>
-        </w:rPr>
-        <w:t>DIVOPUS 3-CPNP VENTANILLA.</w:t>
-      </w:r>
-    </w:p>
-    <w:p>
-      <w:pPr>
-        <w:tabs>
-          <w:tab w:val="left" w:pos="3969"/>
-        </w:tabs>
-        <w:ind w:left="3969" w:hanging="3969"/>
-        <w:rPr>
-          <w:rFonts w:cs="Arial"/>
-          <w:sz w:val="24"/>
-          <w:szCs w:val="24"/>
-          <w:lang w:val="es-PE"/>
-        </w:rPr>
-      </w:pPr>
-    </w:p>
-    <w:p>
-      <w:pPr>
-        <w:tabs>
-          <w:tab w:val="left" w:pos="3402"/>
-        </w:tabs>
-        <w:ind w:left="4111" w:hanging="4111"/>
-        <w:jc w:val="both"/>
-        <w:rPr>
-          <w:rFonts w:cs="Arial"/>
-          <w:sz w:val="24"/>
-          <w:szCs w:val="24"/>
-          <w:lang w:val="es-PE"/>
-        </w:rPr>
-      </w:pPr>
-      <w:r>
-        <w:rPr>
-          <w:rFonts w:cs="Arial"/>
-          <w:b/>
-          <w:sz w:val="24"/>
-          <w:szCs w:val="24"/>
-          <w:lang w:val="pt-BR"/>
-        </w:rPr>
-        <w:t>DIRECCIÓN</w:t>
-        <w:tab/>
-        <w:t xml:space="preserve">        :</w:t>
-      </w:r>
-      <w:r>
-        <w:rPr>
-          <w:rFonts w:cs="Arial"/>
-          <w:sz w:val="24"/>
-          <w:szCs w:val="24"/>
-          <w:lang w:val="pt-BR"/>
-        </w:rPr>
-        <w:t xml:space="preserve"> Av. Pedro Beltrán N°138 Urb. </w:t>
-      </w:r>
-      <w:r>
-        <w:rPr>
-          <w:rFonts w:cs="Arial"/>
-          <w:sz w:val="24"/>
-          <w:szCs w:val="24"/>
-          <w:lang w:val="es-PE"/>
-        </w:rPr>
-        <w:t xml:space="preserve">Satélite -   Ventanilla.</w:t>
-      </w:r>
-    </w:p>
-    <w:p>
-      <w:pPr>
-        <w:tabs>
-          <w:tab w:val="left" w:pos="3402"/>
-          <w:tab w:val="left" w:pos="3828"/>
-          <w:tab w:val="left" w:pos="3969"/>
-        </w:tabs>
-        <w:spacing w:before="240"/>
-        <w:jc w:val="both"/>
-        <w:rPr>
-          <w:rFonts w:cs="Arial"/>
-          <w:sz w:val="24"/>
-          <w:szCs w:val="24"/>
-          <w:lang w:val="es-PE"/>
-        </w:rPr>
-      </w:pPr>
-      <w:r>
-        <w:rPr>
-          <w:rFonts w:cs="Arial"/>
-          <w:b/>
-          <w:bCs/>
-          <w:sz w:val="24"/>
-          <w:szCs w:val="24"/>
-        </w:rPr>
-        <w:t>PLAZO DE DESCARGO</w:t>
-      </w:r>
-      <w:r>
-        <w:rPr>
-          <w:rFonts w:cs="Arial"/>
-          <w:sz w:val="24"/>
-          <w:szCs w:val="24"/>
-        </w:rPr>
-        <w:tab/>
-      </w:r>
-      <w:r>
-        <w:rPr>
-          <w:rFonts w:cs="Arial"/>
-          <w:b/>
-          <w:bCs/>
-          <w:sz w:val="24"/>
-          <w:szCs w:val="24"/>
-        </w:rPr>
-        <w:t xml:space="preserve">    </w:t>
-      </w:r>
-      <w:r>
-        <w:rPr>
-          <w:rFonts w:cs="Arial"/>
-          <w:sz w:val="24"/>
-          <w:szCs w:val="24"/>
-        </w:rPr>
-        <w:t xml:space="preserve">   </w:t>
-      </w:r>
-      <w:r>
-        <w:rPr>
-          <w:rFonts w:cs="Arial"/>
-          <w:b/>
-          <w:bCs/>
-          <w:sz w:val="24"/>
-          <w:szCs w:val="24"/>
-        </w:rPr>
-        <w:t>:</w:t>
-      </w:r>
-      <w:r>
-        <w:rPr>
-          <w:rFonts w:cs="Arial"/>
-          <w:sz w:val="24"/>
-          <w:szCs w:val="24"/>
-        </w:rPr>
-        <w:tab/>
       </w:r>
       <w:r>
         <w:rPr>

</xml_diff>

<commit_message>
Corrige el sello y el domicilio en la plantilla de imputación
- Sello: reemplaza "COMASGEN PNP" por "COMISARIA DE VENTANILLA" (era el
  nombre incorrecto de la unidad en el círculo del sello digital).
- Domicilio (página de notificación): "DIVOPUS 3- CPNP VENTANILLA" pasa
  a "COMISARIA DE VENTANILLA", igual que el sello.
- La sección "NOTIFICACIÓN Y ENTREGA DE ACTO ADMINISTRATIVO" ahora
  empieza siempre en una hoja nueva (salto de página antes del título).
</commit_message>
<xml_diff>
--- a/plantillas/plantilla_imputacion_leve.docx
+++ b/plantillas/plantilla_imputacion_leve.docx
@@ -884,7 +884,7 @@
                                           <w14:round/>
                                         </w14:textOutline>
                                       </w:rPr>
-                                      <w:t>- COMASGEN PNP-</w:t>
+                                      <w:t>- COMISARIA DE VENTANILLA-</w:t>
                                     </w:r>
                                   </w:p>
                                 </w:txbxContent>
@@ -1348,7 +1348,7 @@
                                     <w14:round/>
                                   </w14:textOutline>
                                 </w:rPr>
-                                <w:t>- COMASGEN PNP-</w:t>
+                                <w:t>- COMISARIA DE VENTANILLA-</w:t>
                               </w:r>
                             </w:p>
                           </w:txbxContent>
@@ -1683,6 +1683,7 @@
     </w:p>
     <w:p>
       <w:pPr>
+        <w:pageBreakBefore/>
         <w:jc w:val="center"/>
         <w:rPr>
           <w:rFonts w:cs="Arial"/>
@@ -1851,7 +1852,7 @@
           <w:sz w:val="18"/>
           <w:szCs w:val="18"/>
         </w:rPr>
-        <w:t>DIVOPUS 3- CPNP VENTANILLA</w:t>
+        <w:t>COMISARIA DE VENTANILLA</w:t>
       </w:r>
       <w:r>
         <w:rPr>

</xml_diff>

<commit_message>
Unifica Unidad/Sub-Unidad y Domicilio como DIVOPUS 3-CPNP VENTANILLA
Corrige 3 lugares en la Imputacion que no coincidian:
- Unidad/Sub-Unidad del investigado (lib/imputacion.js): decia
  "CPNP VENTANILLA", ahora "DIVOPUS 3-CPNP VENTANILLA".
- Unidad/Sub-Unidad del superior (plantilla): quedo igual que ya
  estaba, "DIVOPUS 3-CPNP VENTANILLA" (se habia cambiado por error
  a "DIVOPUS 3-VENTANILLA" en un commit previo, revertido).
- Domicilio de la Imputacion (plantilla): decia "COMISARIA DE
  VENTANILLA", ahora "DIVOPUS 3-CPNP VENTANILLA", igual que el
  Domicilio de la Orden de Sancion.
</commit_message>
<xml_diff>
--- a/plantillas/plantilla_imputacion_leve.docx
+++ b/plantillas/plantilla_imputacion_leve.docx
@@ -436,7 +436,7 @@
           <w:sz w:val="24"/>
           <w:szCs w:val="24"/>
         </w:rPr>
-        <w:t>DIVOPUS 3-VENTANILLA.</w:t>
+        <w:t>DIVOPUS 3-CPNP VENTANILLA.</w:t>
       </w:r>
     </w:p>
     <w:p>
@@ -1852,7 +1852,7 @@
           <w:sz w:val="18"/>
           <w:szCs w:val="18"/>
         </w:rPr>
-        <w:t>COMISARIA DE VENTANILLA</w:t>
+        <w:t>DIVOPUS 3-CPNP VENTANILLA</w:t>
       </w:r>
       <w:r>
         <w:rPr>

</xml_diff>